<commit_message>
Welt 2: Tracetabellen nur mit Variablen, Codestellen markiert
AB 1 (A1, A4) + LSG, AB 2 (Infoteile, A2), AB 3 (A5, Infoteil 2) + LSG, Folien 10–12/19/20,
Warm-up W2-05/06/08/14, Lab W2-L1-03, W2-L1-06, W2-L2-05.

Co-Authored-By: Claude Opus 5.5 <noreply@anthropic.com>
Claude-Session: https://claude.ai/code/session_01CemoEYGRdCe5FszEBVFFUP
</commit_message>
<xml_diff>
--- a/materialien/Welt2_Rangliste/2_Arbeitsblaetter/AQ_W2_AB1_Standardbausteine_und_Suchen.docx
+++ b/materialien/Welt2_Rangliste/2_Arbeitsblaetter/AQ_W2_AB1_Standardbausteine_und_Suchen.docx
@@ -5702,7 +5702,7 @@
                 <w:sz w:val="22"/>
                 <w:szCs w:val="22"/>
               </w:rPr>
-              <w:t xml:space="preserve"> auf der Demo-Rangliste und gib den Rückgabewert an.</w:t>
+              <w:t xml:space="preserve"> auf der Demo-Rangliste und gib den Rückgabewert an. Trage eine Zeile vor der Schleife (Startwert von pos) und eine am Ende jedes Schleifendurchlaufs ein.</w:t>
             </w:r>
           </w:p>
         </w:tc>
@@ -5756,11 +5756,9 @@
         <w:tblLayout w:type="fixed"/>
       </w:tblPr>
       <w:tblGrid>
-        <w:gridCol w:w="771"/>
-        <w:gridCol w:w="1735"/>
-        <w:gridCol w:w="2313"/>
-        <w:gridCol w:w="3084"/>
-        <w:gridCol w:w="1735"/>
+        <w:gridCol w:w="1751"/>
+        <w:gridCol w:w="3943"/>
+        <w:gridCol w:w="3943"/>
       </w:tblGrid>
       <w:tr>
         <w:trPr>
@@ -5769,7 +5767,7 @@
         </w:trPr>
         <w:tc>
           <w:tcPr>
-            <w:tcW w:type="dxa" w:w="771"/>
+            <w:tcW w:type="dxa" w:w="1751"/>
             <w:shd w:fill="1F4E79" w:color="auto" w:val="clear"/>
             <w:tcMar>
               <w:top w:type="dxa" w:w="50"/>
@@ -5799,7 +5797,7 @@
         </w:tc>
         <w:tc>
           <w:tcPr>
-            <w:tcW w:type="dxa" w:w="1735"/>
+            <w:tcW w:type="dxa" w:w="3943"/>
             <w:shd w:fill="1F4E79" w:color="auto" w:val="clear"/>
             <w:tcMar>
               <w:top w:type="dxa" w:w="50"/>
@@ -5829,67 +5827,7 @@
         </w:tc>
         <w:tc>
           <w:tcPr>
-            <w:tcW w:type="dxa" w:w="2313"/>
-            <w:shd w:fill="1F4E79" w:color="auto" w:val="clear"/>
-            <w:tcMar>
-              <w:top w:type="dxa" w:w="50"/>
-              <w:left w:type="dxa" w:w="100"/>
-              <w:bottom w:type="dxa" w:w="50"/>
-              <w:right w:type="dxa" w:w="100"/>
-            </w:tcMar>
-            <w:vAlign w:val="center"/>
-          </w:tcPr>
-          <w:p>
-            <w:pPr>
-              <w:spacing w:after="0" w:line="252"/>
-              <w:jc w:val="center"/>
-            </w:pPr>
-            <w:r>
-              <w:rPr>
-                <w:rFonts w:ascii="Calibri" w:cs="Calibri" w:eastAsia="Calibri" w:hAnsi="Calibri"/>
-                <w:b/>
-                <w:bCs/>
-                <w:color w:val="FFFFFF"/>
-                <w:sz w:val="19"/>
-                <w:szCs w:val="19"/>
-              </w:rPr>
-              <w:t xml:space="preserve">punkte ≥ grenze</w:t>
-            </w:r>
-          </w:p>
-        </w:tc>
-        <w:tc>
-          <w:tcPr>
-            <w:tcW w:type="dxa" w:w="3084"/>
-            <w:shd w:fill="1F4E79" w:color="auto" w:val="clear"/>
-            <w:tcMar>
-              <w:top w:type="dxa" w:w="50"/>
-              <w:left w:type="dxa" w:w="100"/>
-              <w:bottom w:type="dxa" w:w="50"/>
-              <w:right w:type="dxa" w:w="100"/>
-            </w:tcMar>
-            <w:vAlign w:val="center"/>
-          </w:tcPr>
-          <w:p>
-            <w:pPr>
-              <w:spacing w:after="0" w:line="252"/>
-              <w:jc w:val="center"/>
-            </w:pPr>
-            <w:r>
-              <w:rPr>
-                <w:rFonts w:ascii="Calibri" w:cs="Calibri" w:eastAsia="Calibri" w:hAnsi="Calibri"/>
-                <w:b/>
-                <w:bCs/>
-                <w:color w:val="FFFFFF"/>
-                <w:sz w:val="19"/>
-                <w:szCs w:val="19"/>
-              </w:rPr>
-              <w:t xml:space="preserve">pos = −1 oder … (w/f)</w:t>
-            </w:r>
-          </w:p>
-        </w:tc>
-        <w:tc>
-          <w:tcPr>
-            <w:tcW w:type="dxa" w:w="1735"/>
+            <w:tcW w:type="dxa" w:w="3943"/>
             <w:shd w:fill="1F4E79" w:color="auto" w:val="clear"/>
             <w:tcMar>
               <w:top w:type="dxa" w:w="50"/>
@@ -5925,7 +5863,7 @@
         </w:trPr>
         <w:tc>
           <w:tcPr>
-            <w:tcW w:type="dxa" w:w="771"/>
+            <w:tcW w:type="dxa" w:w="1751"/>
             <w:tcMar>
               <w:top w:type="dxa" w:w="50"/>
               <w:left w:type="dxa" w:w="100"/>
@@ -5952,7 +5890,7 @@
         </w:tc>
         <w:tc>
           <w:tcPr>
-            <w:tcW w:type="dxa" w:w="1735"/>
+            <w:tcW w:type="dxa" w:w="3943"/>
             <w:tcMar>
               <w:top w:type="dxa" w:w="50"/>
               <w:left w:type="dxa" w:w="100"/>
@@ -5970,43 +5908,7 @@
         </w:tc>
         <w:tc>
           <w:tcPr>
-            <w:tcW w:type="dxa" w:w="2313"/>
-            <w:tcMar>
-              <w:top w:type="dxa" w:w="50"/>
-              <w:left w:type="dxa" w:w="100"/>
-              <w:bottom w:type="dxa" w:w="50"/>
-              <w:right w:type="dxa" w:w="100"/>
-            </w:tcMar>
-            <w:vAlign w:val="center"/>
-          </w:tcPr>
-          <w:p>
-            <w:pPr>
-              <w:spacing w:after="0" w:line="252"/>
-              <w:jc w:val="center"/>
-            </w:pPr>
-          </w:p>
-        </w:tc>
-        <w:tc>
-          <w:tcPr>
-            <w:tcW w:type="dxa" w:w="3084"/>
-            <w:tcMar>
-              <w:top w:type="dxa" w:w="50"/>
-              <w:left w:type="dxa" w:w="100"/>
-              <w:bottom w:type="dxa" w:w="50"/>
-              <w:right w:type="dxa" w:w="100"/>
-            </w:tcMar>
-            <w:vAlign w:val="center"/>
-          </w:tcPr>
-          <w:p>
-            <w:pPr>
-              <w:spacing w:after="0" w:line="252"/>
-              <w:jc w:val="center"/>
-            </w:pPr>
-          </w:p>
-        </w:tc>
-        <w:tc>
-          <w:tcPr>
-            <w:tcW w:type="dxa" w:w="1735"/>
+            <w:tcW w:type="dxa" w:w="3943"/>
             <w:tcMar>
               <w:top w:type="dxa" w:w="50"/>
               <w:left w:type="dxa" w:w="100"/>
@@ -6030,7 +5932,7 @@
         </w:trPr>
         <w:tc>
           <w:tcPr>
-            <w:tcW w:type="dxa" w:w="771"/>
+            <w:tcW w:type="dxa" w:w="1751"/>
             <w:tcMar>
               <w:top w:type="dxa" w:w="50"/>
               <w:left w:type="dxa" w:w="100"/>
@@ -6048,7 +5950,7 @@
         </w:tc>
         <w:tc>
           <w:tcPr>
-            <w:tcW w:type="dxa" w:w="1735"/>
+            <w:tcW w:type="dxa" w:w="3943"/>
             <w:tcMar>
               <w:top w:type="dxa" w:w="50"/>
               <w:left w:type="dxa" w:w="100"/>
@@ -6066,43 +5968,7 @@
         </w:tc>
         <w:tc>
           <w:tcPr>
-            <w:tcW w:type="dxa" w:w="2313"/>
-            <w:tcMar>
-              <w:top w:type="dxa" w:w="50"/>
-              <w:left w:type="dxa" w:w="100"/>
-              <w:bottom w:type="dxa" w:w="50"/>
-              <w:right w:type="dxa" w:w="100"/>
-            </w:tcMar>
-            <w:vAlign w:val="center"/>
-          </w:tcPr>
-          <w:p>
-            <w:pPr>
-              <w:spacing w:after="0" w:line="252"/>
-              <w:jc w:val="center"/>
-            </w:pPr>
-          </w:p>
-        </w:tc>
-        <w:tc>
-          <w:tcPr>
-            <w:tcW w:type="dxa" w:w="3084"/>
-            <w:tcMar>
-              <w:top w:type="dxa" w:w="50"/>
-              <w:left w:type="dxa" w:w="100"/>
-              <w:bottom w:type="dxa" w:w="50"/>
-              <w:right w:type="dxa" w:w="100"/>
-            </w:tcMar>
-            <w:vAlign w:val="center"/>
-          </w:tcPr>
-          <w:p>
-            <w:pPr>
-              <w:spacing w:after="0" w:line="252"/>
-              <w:jc w:val="center"/>
-            </w:pPr>
-          </w:p>
-        </w:tc>
-        <w:tc>
-          <w:tcPr>
-            <w:tcW w:type="dxa" w:w="1735"/>
+            <w:tcW w:type="dxa" w:w="3943"/>
             <w:tcMar>
               <w:top w:type="dxa" w:w="50"/>
               <w:left w:type="dxa" w:w="100"/>
@@ -6126,7 +5992,7 @@
         </w:trPr>
         <w:tc>
           <w:tcPr>
-            <w:tcW w:type="dxa" w:w="771"/>
+            <w:tcW w:type="dxa" w:w="1751"/>
             <w:tcMar>
               <w:top w:type="dxa" w:w="50"/>
               <w:left w:type="dxa" w:w="100"/>
@@ -6144,7 +6010,7 @@
         </w:tc>
         <w:tc>
           <w:tcPr>
-            <w:tcW w:type="dxa" w:w="1735"/>
+            <w:tcW w:type="dxa" w:w="3943"/>
             <w:tcMar>
               <w:top w:type="dxa" w:w="50"/>
               <w:left w:type="dxa" w:w="100"/>
@@ -6162,43 +6028,7 @@
         </w:tc>
         <w:tc>
           <w:tcPr>
-            <w:tcW w:type="dxa" w:w="2313"/>
-            <w:tcMar>
-              <w:top w:type="dxa" w:w="50"/>
-              <w:left w:type="dxa" w:w="100"/>
-              <w:bottom w:type="dxa" w:w="50"/>
-              <w:right w:type="dxa" w:w="100"/>
-            </w:tcMar>
-            <w:vAlign w:val="center"/>
-          </w:tcPr>
-          <w:p>
-            <w:pPr>
-              <w:spacing w:after="0" w:line="252"/>
-              <w:jc w:val="center"/>
-            </w:pPr>
-          </w:p>
-        </w:tc>
-        <w:tc>
-          <w:tcPr>
-            <w:tcW w:type="dxa" w:w="3084"/>
-            <w:tcMar>
-              <w:top w:type="dxa" w:w="50"/>
-              <w:left w:type="dxa" w:w="100"/>
-              <w:bottom w:type="dxa" w:w="50"/>
-              <w:right w:type="dxa" w:w="100"/>
-            </w:tcMar>
-            <w:vAlign w:val="center"/>
-          </w:tcPr>
-          <w:p>
-            <w:pPr>
-              <w:spacing w:after="0" w:line="252"/>
-              <w:jc w:val="center"/>
-            </w:pPr>
-          </w:p>
-        </w:tc>
-        <w:tc>
-          <w:tcPr>
-            <w:tcW w:type="dxa" w:w="1735"/>
+            <w:tcW w:type="dxa" w:w="3943"/>
             <w:tcMar>
               <w:top w:type="dxa" w:w="50"/>
               <w:left w:type="dxa" w:w="100"/>
@@ -6222,7 +6052,7 @@
         </w:trPr>
         <w:tc>
           <w:tcPr>
-            <w:tcW w:type="dxa" w:w="771"/>
+            <w:tcW w:type="dxa" w:w="1751"/>
             <w:tcMar>
               <w:top w:type="dxa" w:w="50"/>
               <w:left w:type="dxa" w:w="100"/>
@@ -6240,7 +6070,7 @@
         </w:tc>
         <w:tc>
           <w:tcPr>
-            <w:tcW w:type="dxa" w:w="1735"/>
+            <w:tcW w:type="dxa" w:w="3943"/>
             <w:tcMar>
               <w:top w:type="dxa" w:w="50"/>
               <w:left w:type="dxa" w:w="100"/>
@@ -6258,43 +6088,7 @@
         </w:tc>
         <w:tc>
           <w:tcPr>
-            <w:tcW w:type="dxa" w:w="2313"/>
-            <w:tcMar>
-              <w:top w:type="dxa" w:w="50"/>
-              <w:left w:type="dxa" w:w="100"/>
-              <w:bottom w:type="dxa" w:w="50"/>
-              <w:right w:type="dxa" w:w="100"/>
-            </w:tcMar>
-            <w:vAlign w:val="center"/>
-          </w:tcPr>
-          <w:p>
-            <w:pPr>
-              <w:spacing w:after="0" w:line="252"/>
-              <w:jc w:val="center"/>
-            </w:pPr>
-          </w:p>
-        </w:tc>
-        <w:tc>
-          <w:tcPr>
-            <w:tcW w:type="dxa" w:w="3084"/>
-            <w:tcMar>
-              <w:top w:type="dxa" w:w="50"/>
-              <w:left w:type="dxa" w:w="100"/>
-              <w:bottom w:type="dxa" w:w="50"/>
-              <w:right w:type="dxa" w:w="100"/>
-            </w:tcMar>
-            <w:vAlign w:val="center"/>
-          </w:tcPr>
-          <w:p>
-            <w:pPr>
-              <w:spacing w:after="0" w:line="252"/>
-              <w:jc w:val="center"/>
-            </w:pPr>
-          </w:p>
-        </w:tc>
-        <w:tc>
-          <w:tcPr>
-            <w:tcW w:type="dxa" w:w="1735"/>
+            <w:tcW w:type="dxa" w:w="3943"/>
             <w:tcMar>
               <w:top w:type="dxa" w:w="50"/>
               <w:left w:type="dxa" w:w="100"/>
@@ -6318,7 +6112,7 @@
         </w:trPr>
         <w:tc>
           <w:tcPr>
-            <w:tcW w:type="dxa" w:w="771"/>
+            <w:tcW w:type="dxa" w:w="1751"/>
             <w:tcMar>
               <w:top w:type="dxa" w:w="50"/>
               <w:left w:type="dxa" w:w="100"/>
@@ -6336,7 +6130,7 @@
         </w:tc>
         <w:tc>
           <w:tcPr>
-            <w:tcW w:type="dxa" w:w="1735"/>
+            <w:tcW w:type="dxa" w:w="3943"/>
             <w:tcMar>
               <w:top w:type="dxa" w:w="50"/>
               <w:left w:type="dxa" w:w="100"/>
@@ -6354,43 +6148,7 @@
         </w:tc>
         <w:tc>
           <w:tcPr>
-            <w:tcW w:type="dxa" w:w="2313"/>
-            <w:tcMar>
-              <w:top w:type="dxa" w:w="50"/>
-              <w:left w:type="dxa" w:w="100"/>
-              <w:bottom w:type="dxa" w:w="50"/>
-              <w:right w:type="dxa" w:w="100"/>
-            </w:tcMar>
-            <w:vAlign w:val="center"/>
-          </w:tcPr>
-          <w:p>
-            <w:pPr>
-              <w:spacing w:after="0" w:line="252"/>
-              <w:jc w:val="center"/>
-            </w:pPr>
-          </w:p>
-        </w:tc>
-        <w:tc>
-          <w:tcPr>
-            <w:tcW w:type="dxa" w:w="3084"/>
-            <w:tcMar>
-              <w:top w:type="dxa" w:w="50"/>
-              <w:left w:type="dxa" w:w="100"/>
-              <w:bottom w:type="dxa" w:w="50"/>
-              <w:right w:type="dxa" w:w="100"/>
-            </w:tcMar>
-            <w:vAlign w:val="center"/>
-          </w:tcPr>
-          <w:p>
-            <w:pPr>
-              <w:spacing w:after="0" w:line="252"/>
-              <w:jc w:val="center"/>
-            </w:pPr>
-          </w:p>
-        </w:tc>
-        <w:tc>
-          <w:tcPr>
-            <w:tcW w:type="dxa" w:w="1735"/>
+            <w:tcW w:type="dxa" w:w="3943"/>
             <w:tcMar>
               <w:top w:type="dxa" w:w="50"/>
               <w:left w:type="dxa" w:w="100"/>
@@ -6414,7 +6172,7 @@
         </w:trPr>
         <w:tc>
           <w:tcPr>
-            <w:tcW w:type="dxa" w:w="771"/>
+            <w:tcW w:type="dxa" w:w="1751"/>
             <w:tcMar>
               <w:top w:type="dxa" w:w="50"/>
               <w:left w:type="dxa" w:w="100"/>
@@ -6432,7 +6190,7 @@
         </w:tc>
         <w:tc>
           <w:tcPr>
-            <w:tcW w:type="dxa" w:w="1735"/>
+            <w:tcW w:type="dxa" w:w="3943"/>
             <w:tcMar>
               <w:top w:type="dxa" w:w="50"/>
               <w:left w:type="dxa" w:w="100"/>
@@ -6450,43 +6208,7 @@
         </w:tc>
         <w:tc>
           <w:tcPr>
-            <w:tcW w:type="dxa" w:w="2313"/>
-            <w:tcMar>
-              <w:top w:type="dxa" w:w="50"/>
-              <w:left w:type="dxa" w:w="100"/>
-              <w:bottom w:type="dxa" w:w="50"/>
-              <w:right w:type="dxa" w:w="100"/>
-            </w:tcMar>
-            <w:vAlign w:val="center"/>
-          </w:tcPr>
-          <w:p>
-            <w:pPr>
-              <w:spacing w:after="0" w:line="252"/>
-              <w:jc w:val="center"/>
-            </w:pPr>
-          </w:p>
-        </w:tc>
-        <w:tc>
-          <w:tcPr>
-            <w:tcW w:type="dxa" w:w="3084"/>
-            <w:tcMar>
-              <w:top w:type="dxa" w:w="50"/>
-              <w:left w:type="dxa" w:w="100"/>
-              <w:bottom w:type="dxa" w:w="50"/>
-              <w:right w:type="dxa" w:w="100"/>
-            </w:tcMar>
-            <w:vAlign w:val="center"/>
-          </w:tcPr>
-          <w:p>
-            <w:pPr>
-              <w:spacing w:after="0" w:line="252"/>
-              <w:jc w:val="center"/>
-            </w:pPr>
-          </w:p>
-        </w:tc>
-        <w:tc>
-          <w:tcPr>
-            <w:tcW w:type="dxa" w:w="1735"/>
+            <w:tcW w:type="dxa" w:w="3943"/>
             <w:tcMar>
               <w:top w:type="dxa" w:w="50"/>
               <w:left w:type="dxa" w:w="100"/>
@@ -6510,7 +6232,7 @@
         </w:trPr>
         <w:tc>
           <w:tcPr>
-            <w:tcW w:type="dxa" w:w="771"/>
+            <w:tcW w:type="dxa" w:w="1751"/>
             <w:tcMar>
               <w:top w:type="dxa" w:w="50"/>
               <w:left w:type="dxa" w:w="100"/>
@@ -6528,7 +6250,7 @@
         </w:tc>
         <w:tc>
           <w:tcPr>
-            <w:tcW w:type="dxa" w:w="1735"/>
+            <w:tcW w:type="dxa" w:w="3943"/>
             <w:tcMar>
               <w:top w:type="dxa" w:w="50"/>
               <w:left w:type="dxa" w:w="100"/>
@@ -6546,43 +6268,7 @@
         </w:tc>
         <w:tc>
           <w:tcPr>
-            <w:tcW w:type="dxa" w:w="2313"/>
-            <w:tcMar>
-              <w:top w:type="dxa" w:w="50"/>
-              <w:left w:type="dxa" w:w="100"/>
-              <w:bottom w:type="dxa" w:w="50"/>
-              <w:right w:type="dxa" w:w="100"/>
-            </w:tcMar>
-            <w:vAlign w:val="center"/>
-          </w:tcPr>
-          <w:p>
-            <w:pPr>
-              <w:spacing w:after="0" w:line="252"/>
-              <w:jc w:val="center"/>
-            </w:pPr>
-          </w:p>
-        </w:tc>
-        <w:tc>
-          <w:tcPr>
-            <w:tcW w:type="dxa" w:w="3084"/>
-            <w:tcMar>
-              <w:top w:type="dxa" w:w="50"/>
-              <w:left w:type="dxa" w:w="100"/>
-              <w:bottom w:type="dxa" w:w="50"/>
-              <w:right w:type="dxa" w:w="100"/>
-            </w:tcMar>
-            <w:vAlign w:val="center"/>
-          </w:tcPr>
-          <w:p>
-            <w:pPr>
-              <w:spacing w:after="0" w:line="252"/>
-              <w:jc w:val="center"/>
-            </w:pPr>
-          </w:p>
-        </w:tc>
-        <w:tc>
-          <w:tcPr>
-            <w:tcW w:type="dxa" w:w="1735"/>
+            <w:tcW w:type="dxa" w:w="3943"/>
             <w:tcMar>
               <w:top w:type="dxa" w:w="50"/>
               <w:left w:type="dxa" w:w="100"/>
@@ -10165,7 +9851,7 @@
                 <w:sz w:val="22"/>
                 <w:szCs w:val="22"/>
               </w:rPr>
-              <w:t xml:space="preserve">Erstelle eine Tracetabelle mit einer Zeile pro Vergleich und gib den Rückgabewert an.</w:t>
+              <w:t xml:space="preserve">Erstelle eine Tracetabelle mit einer Zeile pro Vergleich – also bei jeder Auswertung der Bedingung eintraege[i].getPunkte() == eintraege[j].getPunkte() in Baustein 4 – und gib den Rückgabewert an.</w:t>
             </w:r>
           </w:p>
         </w:tc>
@@ -10219,12 +9905,11 @@
         <w:tblLayout w:type="fixed"/>
       </w:tblPr>
       <w:tblGrid>
-        <w:gridCol w:w="1349"/>
-        <w:gridCol w:w="771"/>
-        <w:gridCol w:w="771"/>
-        <w:gridCol w:w="2410"/>
-        <w:gridCol w:w="2410"/>
-        <w:gridCol w:w="1927"/>
+        <w:gridCol w:w="1686"/>
+        <w:gridCol w:w="964"/>
+        <w:gridCol w:w="964"/>
+        <w:gridCol w:w="3012"/>
+        <w:gridCol w:w="3012"/>
       </w:tblGrid>
       <w:tr>
         <w:trPr>
@@ -10233,7 +9918,7 @@
         </w:trPr>
         <w:tc>
           <w:tcPr>
-            <w:tcW w:type="dxa" w:w="1349"/>
+            <w:tcW w:type="dxa" w:w="1686"/>
             <w:shd w:fill="1F4E79" w:color="auto" w:val="clear"/>
             <w:tcMar>
               <w:top w:type="dxa" w:w="50"/>
@@ -10263,7 +9948,7 @@
         </w:tc>
         <w:tc>
           <w:tcPr>
-            <w:tcW w:type="dxa" w:w="771"/>
+            <w:tcW w:type="dxa" w:w="964"/>
             <w:shd w:fill="1F4E79" w:color="auto" w:val="clear"/>
             <w:tcMar>
               <w:top w:type="dxa" w:w="50"/>
@@ -10293,7 +9978,7 @@
         </w:tc>
         <w:tc>
           <w:tcPr>
-            <w:tcW w:type="dxa" w:w="771"/>
+            <w:tcW w:type="dxa" w:w="964"/>
             <w:shd w:fill="1F4E79" w:color="auto" w:val="clear"/>
             <w:tcMar>
               <w:top w:type="dxa" w:w="50"/>
@@ -10323,7 +10008,7 @@
         </w:tc>
         <w:tc>
           <w:tcPr>
-            <w:tcW w:type="dxa" w:w="2410"/>
+            <w:tcW w:type="dxa" w:w="3012"/>
             <w:shd w:fill="1F4E79" w:color="auto" w:val="clear"/>
             <w:tcMar>
               <w:top w:type="dxa" w:w="50"/>
@@ -10353,7 +10038,7 @@
         </w:tc>
         <w:tc>
           <w:tcPr>
-            <w:tcW w:type="dxa" w:w="2410"/>
+            <w:tcW w:type="dxa" w:w="3012"/>
             <w:shd w:fill="1F4E79" w:color="auto" w:val="clear"/>
             <w:tcMar>
               <w:top w:type="dxa" w:w="50"/>
@@ -10378,36 +10063,6 @@
                 <w:szCs w:val="19"/>
               </w:rPr>
               <w:t xml:space="preserve">eintraege[j].getPunkte()</w:t>
-            </w:r>
-          </w:p>
-        </w:tc>
-        <w:tc>
-          <w:tcPr>
-            <w:tcW w:type="dxa" w:w="1927"/>
-            <w:shd w:fill="1F4E79" w:color="auto" w:val="clear"/>
-            <w:tcMar>
-              <w:top w:type="dxa" w:w="50"/>
-              <w:left w:type="dxa" w:w="100"/>
-              <w:bottom w:type="dxa" w:w="50"/>
-              <w:right w:type="dxa" w:w="100"/>
-            </w:tcMar>
-            <w:vAlign w:val="center"/>
-          </w:tcPr>
-          <w:p>
-            <w:pPr>
-              <w:spacing w:after="0" w:line="252"/>
-              <w:jc w:val="center"/>
-            </w:pPr>
-            <w:r>
-              <w:rPr>
-                <w:rFonts w:ascii="Calibri" w:cs="Calibri" w:eastAsia="Calibri" w:hAnsi="Calibri"/>
-                <w:b/>
-                <w:bCs/>
-                <w:color w:val="FFFFFF"/>
-                <w:sz w:val="19"/>
-                <w:szCs w:val="19"/>
-              </w:rPr>
-              <w:t xml:space="preserve">gleich? (w/f)</w:t>
             </w:r>
           </w:p>
         </w:tc>
@@ -10419,7 +10074,7 @@
         </w:trPr>
         <w:tc>
           <w:tcPr>
-            <w:tcW w:type="dxa" w:w="1349"/>
+            <w:tcW w:type="dxa" w:w="1686"/>
             <w:tcMar>
               <w:top w:type="dxa" w:w="50"/>
               <w:left w:type="dxa" w:w="100"/>
@@ -10437,7 +10092,7 @@
         </w:tc>
         <w:tc>
           <w:tcPr>
-            <w:tcW w:type="dxa" w:w="771"/>
+            <w:tcW w:type="dxa" w:w="964"/>
             <w:tcMar>
               <w:top w:type="dxa" w:w="50"/>
               <w:left w:type="dxa" w:w="100"/>
@@ -10455,7 +10110,7 @@
         </w:tc>
         <w:tc>
           <w:tcPr>
-            <w:tcW w:type="dxa" w:w="771"/>
+            <w:tcW w:type="dxa" w:w="964"/>
             <w:tcMar>
               <w:top w:type="dxa" w:w="50"/>
               <w:left w:type="dxa" w:w="100"/>
@@ -10473,7 +10128,7 @@
         </w:tc>
         <w:tc>
           <w:tcPr>
-            <w:tcW w:type="dxa" w:w="2410"/>
+            <w:tcW w:type="dxa" w:w="3012"/>
             <w:tcMar>
               <w:top w:type="dxa" w:w="50"/>
               <w:left w:type="dxa" w:w="100"/>
@@ -10491,25 +10146,7 @@
         </w:tc>
         <w:tc>
           <w:tcPr>
-            <w:tcW w:type="dxa" w:w="2410"/>
-            <w:tcMar>
-              <w:top w:type="dxa" w:w="50"/>
-              <w:left w:type="dxa" w:w="100"/>
-              <w:bottom w:type="dxa" w:w="50"/>
-              <w:right w:type="dxa" w:w="100"/>
-            </w:tcMar>
-            <w:vAlign w:val="center"/>
-          </w:tcPr>
-          <w:p>
-            <w:pPr>
-              <w:spacing w:after="0" w:line="252"/>
-              <w:jc w:val="center"/>
-            </w:pPr>
-          </w:p>
-        </w:tc>
-        <w:tc>
-          <w:tcPr>
-            <w:tcW w:type="dxa" w:w="1927"/>
+            <w:tcW w:type="dxa" w:w="3012"/>
             <w:tcMar>
               <w:top w:type="dxa" w:w="50"/>
               <w:left w:type="dxa" w:w="100"/>
@@ -10533,7 +10170,7 @@
         </w:trPr>
         <w:tc>
           <w:tcPr>
-            <w:tcW w:type="dxa" w:w="1349"/>
+            <w:tcW w:type="dxa" w:w="1686"/>
             <w:tcMar>
               <w:top w:type="dxa" w:w="50"/>
               <w:left w:type="dxa" w:w="100"/>
@@ -10551,7 +10188,7 @@
         </w:tc>
         <w:tc>
           <w:tcPr>
-            <w:tcW w:type="dxa" w:w="771"/>
+            <w:tcW w:type="dxa" w:w="964"/>
             <w:tcMar>
               <w:top w:type="dxa" w:w="50"/>
               <w:left w:type="dxa" w:w="100"/>
@@ -10569,7 +10206,7 @@
         </w:tc>
         <w:tc>
           <w:tcPr>
-            <w:tcW w:type="dxa" w:w="771"/>
+            <w:tcW w:type="dxa" w:w="964"/>
             <w:tcMar>
               <w:top w:type="dxa" w:w="50"/>
               <w:left w:type="dxa" w:w="100"/>
@@ -10587,7 +10224,7 @@
         </w:tc>
         <w:tc>
           <w:tcPr>
-            <w:tcW w:type="dxa" w:w="2410"/>
+            <w:tcW w:type="dxa" w:w="3012"/>
             <w:tcMar>
               <w:top w:type="dxa" w:w="50"/>
               <w:left w:type="dxa" w:w="100"/>
@@ -10605,25 +10242,7 @@
         </w:tc>
         <w:tc>
           <w:tcPr>
-            <w:tcW w:type="dxa" w:w="2410"/>
-            <w:tcMar>
-              <w:top w:type="dxa" w:w="50"/>
-              <w:left w:type="dxa" w:w="100"/>
-              <w:bottom w:type="dxa" w:w="50"/>
-              <w:right w:type="dxa" w:w="100"/>
-            </w:tcMar>
-            <w:vAlign w:val="center"/>
-          </w:tcPr>
-          <w:p>
-            <w:pPr>
-              <w:spacing w:after="0" w:line="252"/>
-              <w:jc w:val="center"/>
-            </w:pPr>
-          </w:p>
-        </w:tc>
-        <w:tc>
-          <w:tcPr>
-            <w:tcW w:type="dxa" w:w="1927"/>
+            <w:tcW w:type="dxa" w:w="3012"/>
             <w:tcMar>
               <w:top w:type="dxa" w:w="50"/>
               <w:left w:type="dxa" w:w="100"/>
@@ -10647,7 +10266,7 @@
         </w:trPr>
         <w:tc>
           <w:tcPr>
-            <w:tcW w:type="dxa" w:w="1349"/>
+            <w:tcW w:type="dxa" w:w="1686"/>
             <w:tcMar>
               <w:top w:type="dxa" w:w="50"/>
               <w:left w:type="dxa" w:w="100"/>
@@ -10665,7 +10284,7 @@
         </w:tc>
         <w:tc>
           <w:tcPr>
-            <w:tcW w:type="dxa" w:w="771"/>
+            <w:tcW w:type="dxa" w:w="964"/>
             <w:tcMar>
               <w:top w:type="dxa" w:w="50"/>
               <w:left w:type="dxa" w:w="100"/>
@@ -10683,7 +10302,7 @@
         </w:tc>
         <w:tc>
           <w:tcPr>
-            <w:tcW w:type="dxa" w:w="771"/>
+            <w:tcW w:type="dxa" w:w="964"/>
             <w:tcMar>
               <w:top w:type="dxa" w:w="50"/>
               <w:left w:type="dxa" w:w="100"/>
@@ -10701,7 +10320,7 @@
         </w:tc>
         <w:tc>
           <w:tcPr>
-            <w:tcW w:type="dxa" w:w="2410"/>
+            <w:tcW w:type="dxa" w:w="3012"/>
             <w:tcMar>
               <w:top w:type="dxa" w:w="50"/>
               <w:left w:type="dxa" w:w="100"/>
@@ -10719,25 +10338,7 @@
         </w:tc>
         <w:tc>
           <w:tcPr>
-            <w:tcW w:type="dxa" w:w="2410"/>
-            <w:tcMar>
-              <w:top w:type="dxa" w:w="50"/>
-              <w:left w:type="dxa" w:w="100"/>
-              <w:bottom w:type="dxa" w:w="50"/>
-              <w:right w:type="dxa" w:w="100"/>
-            </w:tcMar>
-            <w:vAlign w:val="center"/>
-          </w:tcPr>
-          <w:p>
-            <w:pPr>
-              <w:spacing w:after="0" w:line="252"/>
-              <w:jc w:val="center"/>
-            </w:pPr>
-          </w:p>
-        </w:tc>
-        <w:tc>
-          <w:tcPr>
-            <w:tcW w:type="dxa" w:w="1927"/>
+            <w:tcW w:type="dxa" w:w="3012"/>
             <w:tcMar>
               <w:top w:type="dxa" w:w="50"/>
               <w:left w:type="dxa" w:w="100"/>
@@ -10761,7 +10362,7 @@
         </w:trPr>
         <w:tc>
           <w:tcPr>
-            <w:tcW w:type="dxa" w:w="1349"/>
+            <w:tcW w:type="dxa" w:w="1686"/>
             <w:tcMar>
               <w:top w:type="dxa" w:w="50"/>
               <w:left w:type="dxa" w:w="100"/>
@@ -10779,7 +10380,7 @@
         </w:tc>
         <w:tc>
           <w:tcPr>
-            <w:tcW w:type="dxa" w:w="771"/>
+            <w:tcW w:type="dxa" w:w="964"/>
             <w:tcMar>
               <w:top w:type="dxa" w:w="50"/>
               <w:left w:type="dxa" w:w="100"/>
@@ -10797,7 +10398,7 @@
         </w:tc>
         <w:tc>
           <w:tcPr>
-            <w:tcW w:type="dxa" w:w="771"/>
+            <w:tcW w:type="dxa" w:w="964"/>
             <w:tcMar>
               <w:top w:type="dxa" w:w="50"/>
               <w:left w:type="dxa" w:w="100"/>
@@ -10815,7 +10416,7 @@
         </w:tc>
         <w:tc>
           <w:tcPr>
-            <w:tcW w:type="dxa" w:w="2410"/>
+            <w:tcW w:type="dxa" w:w="3012"/>
             <w:tcMar>
               <w:top w:type="dxa" w:w="50"/>
               <w:left w:type="dxa" w:w="100"/>
@@ -10833,25 +10434,7 @@
         </w:tc>
         <w:tc>
           <w:tcPr>
-            <w:tcW w:type="dxa" w:w="2410"/>
-            <w:tcMar>
-              <w:top w:type="dxa" w:w="50"/>
-              <w:left w:type="dxa" w:w="100"/>
-              <w:bottom w:type="dxa" w:w="50"/>
-              <w:right w:type="dxa" w:w="100"/>
-            </w:tcMar>
-            <w:vAlign w:val="center"/>
-          </w:tcPr>
-          <w:p>
-            <w:pPr>
-              <w:spacing w:after="0" w:line="252"/>
-              <w:jc w:val="center"/>
-            </w:pPr>
-          </w:p>
-        </w:tc>
-        <w:tc>
-          <w:tcPr>
-            <w:tcW w:type="dxa" w:w="1927"/>
+            <w:tcW w:type="dxa" w:w="3012"/>
             <w:tcMar>
               <w:top w:type="dxa" w:w="50"/>
               <w:left w:type="dxa" w:w="100"/>
@@ -10875,7 +10458,7 @@
         </w:trPr>
         <w:tc>
           <w:tcPr>
-            <w:tcW w:type="dxa" w:w="1349"/>
+            <w:tcW w:type="dxa" w:w="1686"/>
             <w:tcMar>
               <w:top w:type="dxa" w:w="50"/>
               <w:left w:type="dxa" w:w="100"/>
@@ -10893,7 +10476,7 @@
         </w:tc>
         <w:tc>
           <w:tcPr>
-            <w:tcW w:type="dxa" w:w="771"/>
+            <w:tcW w:type="dxa" w:w="964"/>
             <w:tcMar>
               <w:top w:type="dxa" w:w="50"/>
               <w:left w:type="dxa" w:w="100"/>
@@ -10911,7 +10494,7 @@
         </w:tc>
         <w:tc>
           <w:tcPr>
-            <w:tcW w:type="dxa" w:w="771"/>
+            <w:tcW w:type="dxa" w:w="964"/>
             <w:tcMar>
               <w:top w:type="dxa" w:w="50"/>
               <w:left w:type="dxa" w:w="100"/>
@@ -10929,7 +10512,7 @@
         </w:tc>
         <w:tc>
           <w:tcPr>
-            <w:tcW w:type="dxa" w:w="2410"/>
+            <w:tcW w:type="dxa" w:w="3012"/>
             <w:tcMar>
               <w:top w:type="dxa" w:w="50"/>
               <w:left w:type="dxa" w:w="100"/>
@@ -10947,25 +10530,7 @@
         </w:tc>
         <w:tc>
           <w:tcPr>
-            <w:tcW w:type="dxa" w:w="2410"/>
-            <w:tcMar>
-              <w:top w:type="dxa" w:w="50"/>
-              <w:left w:type="dxa" w:w="100"/>
-              <w:bottom w:type="dxa" w:w="50"/>
-              <w:right w:type="dxa" w:w="100"/>
-            </w:tcMar>
-            <w:vAlign w:val="center"/>
-          </w:tcPr>
-          <w:p>
-            <w:pPr>
-              <w:spacing w:after="0" w:line="252"/>
-              <w:jc w:val="center"/>
-            </w:pPr>
-          </w:p>
-        </w:tc>
-        <w:tc>
-          <w:tcPr>
-            <w:tcW w:type="dxa" w:w="1927"/>
+            <w:tcW w:type="dxa" w:w="3012"/>
             <w:tcMar>
               <w:top w:type="dxa" w:w="50"/>
               <w:left w:type="dxa" w:w="100"/>
@@ -10989,7 +10554,7 @@
         </w:trPr>
         <w:tc>
           <w:tcPr>
-            <w:tcW w:type="dxa" w:w="1349"/>
+            <w:tcW w:type="dxa" w:w="1686"/>
             <w:tcMar>
               <w:top w:type="dxa" w:w="50"/>
               <w:left w:type="dxa" w:w="100"/>
@@ -11007,7 +10572,7 @@
         </w:tc>
         <w:tc>
           <w:tcPr>
-            <w:tcW w:type="dxa" w:w="771"/>
+            <w:tcW w:type="dxa" w:w="964"/>
             <w:tcMar>
               <w:top w:type="dxa" w:w="50"/>
               <w:left w:type="dxa" w:w="100"/>
@@ -11025,7 +10590,7 @@
         </w:tc>
         <w:tc>
           <w:tcPr>
-            <w:tcW w:type="dxa" w:w="771"/>
+            <w:tcW w:type="dxa" w:w="964"/>
             <w:tcMar>
               <w:top w:type="dxa" w:w="50"/>
               <w:left w:type="dxa" w:w="100"/>
@@ -11043,7 +10608,7 @@
         </w:tc>
         <w:tc>
           <w:tcPr>
-            <w:tcW w:type="dxa" w:w="2410"/>
+            <w:tcW w:type="dxa" w:w="3012"/>
             <w:tcMar>
               <w:top w:type="dxa" w:w="50"/>
               <w:left w:type="dxa" w:w="100"/>
@@ -11061,25 +10626,7 @@
         </w:tc>
         <w:tc>
           <w:tcPr>
-            <w:tcW w:type="dxa" w:w="2410"/>
-            <w:tcMar>
-              <w:top w:type="dxa" w:w="50"/>
-              <w:left w:type="dxa" w:w="100"/>
-              <w:bottom w:type="dxa" w:w="50"/>
-              <w:right w:type="dxa" w:w="100"/>
-            </w:tcMar>
-            <w:vAlign w:val="center"/>
-          </w:tcPr>
-          <w:p>
-            <w:pPr>
-              <w:spacing w:after="0" w:line="252"/>
-              <w:jc w:val="center"/>
-            </w:pPr>
-          </w:p>
-        </w:tc>
-        <w:tc>
-          <w:tcPr>
-            <w:tcW w:type="dxa" w:w="1927"/>
+            <w:tcW w:type="dxa" w:w="3012"/>
             <w:tcMar>
               <w:top w:type="dxa" w:w="50"/>
               <w:left w:type="dxa" w:w="100"/>
@@ -11103,7 +10650,7 @@
         </w:trPr>
         <w:tc>
           <w:tcPr>
-            <w:tcW w:type="dxa" w:w="1349"/>
+            <w:tcW w:type="dxa" w:w="1686"/>
             <w:tcMar>
               <w:top w:type="dxa" w:w="50"/>
               <w:left w:type="dxa" w:w="100"/>
@@ -11121,7 +10668,7 @@
         </w:tc>
         <w:tc>
           <w:tcPr>
-            <w:tcW w:type="dxa" w:w="771"/>
+            <w:tcW w:type="dxa" w:w="964"/>
             <w:tcMar>
               <w:top w:type="dxa" w:w="50"/>
               <w:left w:type="dxa" w:w="100"/>
@@ -11139,7 +10686,7 @@
         </w:tc>
         <w:tc>
           <w:tcPr>
-            <w:tcW w:type="dxa" w:w="771"/>
+            <w:tcW w:type="dxa" w:w="964"/>
             <w:tcMar>
               <w:top w:type="dxa" w:w="50"/>
               <w:left w:type="dxa" w:w="100"/>
@@ -11157,7 +10704,7 @@
         </w:tc>
         <w:tc>
           <w:tcPr>
-            <w:tcW w:type="dxa" w:w="2410"/>
+            <w:tcW w:type="dxa" w:w="3012"/>
             <w:tcMar>
               <w:top w:type="dxa" w:w="50"/>
               <w:left w:type="dxa" w:w="100"/>
@@ -11175,25 +10722,7 @@
         </w:tc>
         <w:tc>
           <w:tcPr>
-            <w:tcW w:type="dxa" w:w="2410"/>
-            <w:tcMar>
-              <w:top w:type="dxa" w:w="50"/>
-              <w:left w:type="dxa" w:w="100"/>
-              <w:bottom w:type="dxa" w:w="50"/>
-              <w:right w:type="dxa" w:w="100"/>
-            </w:tcMar>
-            <w:vAlign w:val="center"/>
-          </w:tcPr>
-          <w:p>
-            <w:pPr>
-              <w:spacing w:after="0" w:line="252"/>
-              <w:jc w:val="center"/>
-            </w:pPr>
-          </w:p>
-        </w:tc>
-        <w:tc>
-          <w:tcPr>
-            <w:tcW w:type="dxa" w:w="1927"/>
+            <w:tcW w:type="dxa" w:w="3012"/>
             <w:tcMar>
               <w:top w:type="dxa" w:w="50"/>
               <w:left w:type="dxa" w:w="100"/>
@@ -11217,7 +10746,7 @@
         </w:trPr>
         <w:tc>
           <w:tcPr>
-            <w:tcW w:type="dxa" w:w="1349"/>
+            <w:tcW w:type="dxa" w:w="1686"/>
             <w:tcMar>
               <w:top w:type="dxa" w:w="50"/>
               <w:left w:type="dxa" w:w="100"/>
@@ -11235,7 +10764,7 @@
         </w:tc>
         <w:tc>
           <w:tcPr>
-            <w:tcW w:type="dxa" w:w="771"/>
+            <w:tcW w:type="dxa" w:w="964"/>
             <w:tcMar>
               <w:top w:type="dxa" w:w="50"/>
               <w:left w:type="dxa" w:w="100"/>
@@ -11253,7 +10782,7 @@
         </w:tc>
         <w:tc>
           <w:tcPr>
-            <w:tcW w:type="dxa" w:w="771"/>
+            <w:tcW w:type="dxa" w:w="964"/>
             <w:tcMar>
               <w:top w:type="dxa" w:w="50"/>
               <w:left w:type="dxa" w:w="100"/>
@@ -11271,7 +10800,7 @@
         </w:tc>
         <w:tc>
           <w:tcPr>
-            <w:tcW w:type="dxa" w:w="2410"/>
+            <w:tcW w:type="dxa" w:w="3012"/>
             <w:tcMar>
               <w:top w:type="dxa" w:w="50"/>
               <w:left w:type="dxa" w:w="100"/>
@@ -11289,25 +10818,7 @@
         </w:tc>
         <w:tc>
           <w:tcPr>
-            <w:tcW w:type="dxa" w:w="2410"/>
-            <w:tcMar>
-              <w:top w:type="dxa" w:w="50"/>
-              <w:left w:type="dxa" w:w="100"/>
-              <w:bottom w:type="dxa" w:w="50"/>
-              <w:right w:type="dxa" w:w="100"/>
-            </w:tcMar>
-            <w:vAlign w:val="center"/>
-          </w:tcPr>
-          <w:p>
-            <w:pPr>
-              <w:spacing w:after="0" w:line="252"/>
-              <w:jc w:val="center"/>
-            </w:pPr>
-          </w:p>
-        </w:tc>
-        <w:tc>
-          <w:tcPr>
-            <w:tcW w:type="dxa" w:w="1927"/>
+            <w:tcW w:type="dxa" w:w="3012"/>
             <w:tcMar>
               <w:top w:type="dxa" w:w="50"/>
               <w:left w:type="dxa" w:w="100"/>

</xml_diff>